<commit_message>
Save local work before restoring README/workflow
</commit_message>
<xml_diff>
--- a/READMEs/Gemini ANNs 1.1.docx
+++ b/READMEs/Gemini ANNs 1.1.docx
@@ -22,6 +22,118 @@
         <w:t>Target Asset: CME Heating Oil (OHLC Historical Datasets, 1982-Present)</w:t>
       </w:r>
     </w:p>
+    <w:p>
+      <w:pPr>
+        <w:pStyle w:val="NormalWeb"/>
+        <w:numPr>
+          <w:ilvl w:val="0"/>
+          <w:numId w:val="1"/>
+        </w:numPr>
+        <w:rPr>
+          <w:color w:val="EE0000"/>
+        </w:rPr>
+      </w:pPr>
+      <w:r>
+        <w:rPr>
+          <w:color w:val="EE0000"/>
+        </w:rPr>
+        <w:t>NOTE</w:t>
+      </w:r>
+      <w:r>
+        <w:rPr>
+          <w:color w:val="EE0000"/>
+        </w:rPr>
+        <w:t xml:space="preserve"> 8.9.2026</w:t>
+      </w:r>
+      <w:r>
+        <w:rPr>
+          <w:color w:val="EE0000"/>
+        </w:rPr>
+        <w:t xml:space="preserve">: </w:t>
+      </w:r>
+      <w:r>
+        <w:rPr>
+          <w:b/>
+          <w:bCs/>
+          <w:color w:val="EE0000"/>
+        </w:rPr>
+        <w:t>The READMEs Need Updating:</w:t>
+      </w:r>
+      <w:r>
+        <w:rPr>
+          <w:color w:val="EE0000"/>
+        </w:rPr>
+        <w:t xml:space="preserve"> Both </w:t>
+      </w:r>
+      <w:r>
+        <w:rPr>
+          <w:b/>
+          <w:bCs/>
+          <w:color w:val="EE0000"/>
+        </w:rPr>
+        <w:t>README 1.1</w:t>
+      </w:r>
+      <w:r>
+        <w:rPr>
+          <w:color w:val="EE0000"/>
+        </w:rPr>
+        <w:t xml:space="preserve"> and </w:t>
+      </w:r>
+      <w:r>
+        <w:rPr>
+          <w:b/>
+          <w:bCs/>
+          <w:color w:val="EE0000"/>
+        </w:rPr>
+        <w:t>README 1.2</w:t>
+      </w:r>
+      <w:r>
+        <w:rPr>
+          <w:color w:val="EE0000"/>
+        </w:rPr>
+        <w:t xml:space="preserve"> contain explicit step-by-step terminal commands instructing future users to execute </w:t>
+      </w:r>
+      <w:r>
+        <w:rPr>
+          <w:rStyle w:val="HTMLCode"/>
+          <w:color w:val="EE0000"/>
+        </w:rPr>
+        <w:t>python ho_infer_ann_retest1_gem.py</w:t>
+      </w:r>
+      <w:r>
+        <w:rPr>
+          <w:color w:val="EE0000"/>
+        </w:rPr>
+        <w:t xml:space="preserve">. You will want to update those text files so the command explicitly calls </w:t>
+      </w:r>
+      <w:r>
+        <w:rPr>
+          <w:rStyle w:val="HTMLCode"/>
+          <w:color w:val="EE0000"/>
+        </w:rPr>
+        <w:t>python ho_infer_ann_retest1_gem_REPLACE.py</w:t>
+      </w:r>
+      <w:r>
+        <w:rPr>
+          <w:color w:val="EE0000"/>
+        </w:rPr>
+        <w:t xml:space="preserve"> instead.</w:t>
+      </w:r>
+    </w:p>
+    <w:p>
+      <w:pPr>
+        <w:pStyle w:val="NormalWeb"/>
+        <w:rPr>
+          <w:color w:val="EE0000"/>
+        </w:rPr>
+      </w:pPr>
+      <w:r>
+        <w:rPr>
+          <w:color w:val="EE0000"/>
+        </w:rPr>
+        <w:t>If you update the commands in those two Word/Markdown docs, your entire replication package will be perfectly synchronized and ready to run.</w:t>
+      </w:r>
+    </w:p>
     <w:p/>
     <w:p>
       <w:r>
@@ -59,15 +171,8 @@
     </w:p>
     <w:p>
       <w:r>
-        <w:t>The workspace operates via a strictly isolated, hardware-safe execution environment (</w:t>
-      </w:r>
-      <w:proofErr w:type="spellStart"/>
-      <w:r>
-        <w:t>Gemini_ANNs</w:t>
-      </w:r>
-      <w:proofErr w:type="spellEnd"/>
-      <w:r>
-        <w:t>), supporting both local CPU and WSL2 GPU acceleration. The end-to-end operational pipeline consists of three distinct phases:</w:t>
+        <w:lastRenderedPageBreak/>
+        <w:t>The workspace operates via a strictly isolated, hardware-safe execution environment (Gemini_ANNs), supporting both local CPU and WSL2 GPU acceleration. The end-to-end operational pipeline consists of three distinct phases:</w:t>
       </w:r>
     </w:p>
     <w:p/>
@@ -83,302 +188,169 @@
     </w:p>
     <w:p>
       <w:r>
-        <w:t xml:space="preserve">   - Computes group-safe rolling shifts (</w:t>
-      </w:r>
-      <w:proofErr w:type="spellStart"/>
-      <w:r>
-        <w:t>PrevClose</w:t>
-      </w:r>
-      <w:proofErr w:type="spellEnd"/>
-      <w:r>
-        <w:t>) to prevent lookahead bias.</w:t>
-      </w:r>
-    </w:p>
-    <w:p>
+        <w:t xml:space="preserve">   - Computes group-safe rolling shifts (PrevClose) to prevent lookahead bias.</w:t>
+      </w:r>
+    </w:p>
+    <w:p>
+      <w:r>
+        <w:t xml:space="preserve">   - Applies robust standard scaling (mu, sigma) derived exclusively from the training dataset to align feature distributions.</w:t>
+      </w:r>
+    </w:p>
+    <w:p/>
+    <w:p>
+      <w:r>
+        <w:t>2. Training &amp; Serialization (ho_train_ann_retest1_gem.py):</w:t>
+      </w:r>
+    </w:p>
+    <w:p>
+      <w:r>
+        <w:t xml:space="preserve">   - Topology: Fully Connected Feedforward Deep Neural Network (MLP) consisting of an Input layer, Dense hidden layers (256 -&gt; 128 -&gt; 64 neurons with ReLU activations and L2 regularization), and a single Linear output neuron.</w:t>
+      </w:r>
+    </w:p>
+    <w:p>
+      <w:r>
+        <w:t xml:space="preserve">   - Optimization: Adam optimizer with gradient clipping and ModelCheckpoint callbacks monitoring validation loss (val_loss) to prevent overfitting.</w:t>
+      </w:r>
+    </w:p>
+    <w:p>
+      <w:r>
+        <w:t xml:space="preserve">   - Artifacts: Serializes the optimized weights (model_final.keras, model_best.keras) and normalization parameters (scaler.json) into structured directories.</w:t>
+      </w:r>
+    </w:p>
+    <w:p/>
+    <w:p>
+      <w:r>
+        <w:t>3. Inference &amp; Advanced Evaluation (ho_infer_ann_retest1_gem.py &amp; advanced_eval_metrics_gem.py):</w:t>
+      </w:r>
+    </w:p>
+    <w:p>
+      <w:r>
+        <w:t xml:space="preserve">   - Feeds out-of-sample testing data through the serialized model to reconstruct price-space predictions (pred_close).</w:t>
+      </w:r>
+    </w:p>
+    <w:p>
+      <w:r>
+        <w:t xml:space="preserve">   - Computes a comprehensive suite of advanced validation metrics to evaluate real-world trading utility.</w:t>
+      </w:r>
+    </w:p>
+    <w:p/>
+    <w:p>
+      <w:r>
+        <w:t>---</w:t>
+      </w:r>
+    </w:p>
+    <w:p/>
+    <w:p>
+      <w:r>
+        <w:t>## 3. Black-Box Fidelity &amp; Empirical Findings</w:t>
+      </w:r>
+    </w:p>
+    <w:p>
+      <w:r>
+        <w:t>When evaluated against out-of-sample data, the ANN demonstrates profound capabilities that standard error metrics conceal:</w:t>
+      </w:r>
+    </w:p>
+    <w:p/>
+    <w:p>
+      <w:r>
+        <w:t>* Macro-Structural Rank Preservation (IC approx 0.9780): The Spearman Rank Information Coefficient reveals an extraordinarily high correlation in global price ordering. The ANN successfully internalizes the multi-decade macro-trajectory of the commodity rather than fitting random noise.</w:t>
+      </w:r>
+    </w:p>
+    <w:p>
+      <w:r>
+        <w:t>* Directional Edge &amp; Turning Point Precision: Beyond static error rates, the model achieves positive directional hit rates (&gt;52%) and robust inflection-point precision (&gt;56%), indicating that its multi-layer non-linear transformations capture real market momentum shifts and local reversals.</w:t>
+      </w:r>
+    </w:p>
+    <w:p>
+      <w:r>
+        <w:t>* Atheoretical Viability: Because the neural network maps non-linear feature interactions without being handcuffed by stationary equilibrium assumptions, it serves as a viable, empirical foundation for automated trading and execution backtesters.</w:t>
+      </w:r>
+    </w:p>
+    <w:p/>
+    <w:p>
+      <w:r>
+        <w:t>---</w:t>
+      </w:r>
+    </w:p>
+    <w:p/>
+    <w:p>
+      <w:r>
+        <w:t>## 4. Replication Guide (For Future Maintainers)</w:t>
+      </w:r>
+    </w:p>
+    <w:p>
+      <w:r>
+        <w:t>To replicate this simulation environment and regenerate all models, predictions, and evaluation manifests from scratch, execute the following sequence:</w:t>
+      </w:r>
+    </w:p>
+    <w:p/>
+    <w:p>
+      <w:r>
+        <w:t>Prerequisites:</w:t>
+      </w:r>
+    </w:p>
+    <w:p>
+      <w:r>
+        <w:t>- Python 3.10+</w:t>
+      </w:r>
+    </w:p>
+    <w:p>
+      <w:r>
+        <w:t>- TensorFlow 2.x, NumPy, Pandas, Scikit-Learn, SciPy</w:t>
+      </w:r>
+    </w:p>
+    <w:p/>
+    <w:p>
+      <w:r>
+        <w:t>Step-by-Step Execution:</w:t>
+      </w:r>
+    </w:p>
+    <w:p>
+      <w:r>
+        <w:t>1. Clone/Setup Workspace: Ensure all training, validation, and testing CSV files reside in the root directory.</w:t>
+      </w:r>
+    </w:p>
+    <w:p>
+      <w:r>
+        <w:t>2. Execute Training:</w:t>
+      </w:r>
+    </w:p>
+    <w:p>
+      <w:r>
+        <w:t xml:space="preserve">   python ho_train_ann_retest1_gem.py --train_csv hoxnc_training_retest1.csv --val_csv hoxnc_validation_retest1.csv --outdir artifacts/ho_ann_run_retest1</w:t>
+      </w:r>
+    </w:p>
+    <w:p>
+      <w:r>
+        <w:t>3. Run Out-of-Sample Inference:</w:t>
+      </w:r>
+    </w:p>
+    <w:p>
+      <w:r>
+        <w:t xml:space="preserve">   python ho_infer_ann_retest1_gem.py --input_csv hoxnc_testing_retest1.csv --model artifacts/ho_ann_run_retest1/model_final.keras --scaler </w:t>
+      </w:r>
       <w:r>
         <w:lastRenderedPageBreak/>
-        <w:t xml:space="preserve">   - Applies robust standard scaling (mu, sigma) derived exclusively from the training dataset to align feature distributions.</w:t>
+        <w:t>artifacts/ho_ann_run_retest1/scaler.json --out_csv artifacts/ho_ann_run_retest1/inference_rebuild/preds_model_retest1.json</w:t>
+      </w:r>
+    </w:p>
+    <w:p>
+      <w:r>
+        <w:t>4. Evaluate Advanced Metrics:</w:t>
+      </w:r>
+    </w:p>
+    <w:p>
+      <w:r>
+        <w:t xml:space="preserve">   python advanced_eval_metrics_gem.py</w:t>
       </w:r>
     </w:p>
     <w:p/>
     <w:p>
       <w:r>
-        <w:t>2. Training &amp; Serialization (ho_train_ann_retest1_gem.py):</w:t>
-      </w:r>
-    </w:p>
-    <w:p>
-      <w:r>
-        <w:t xml:space="preserve">   - Topology: Fully Connected Feedforward Deep Neural Network (MLP) consisting of an Input layer, Dense hidden layers (256 -&gt; 128 -&gt; 64 neurons with </w:t>
-      </w:r>
-      <w:proofErr w:type="spellStart"/>
-      <w:r>
-        <w:t>ReLU</w:t>
-      </w:r>
-      <w:proofErr w:type="spellEnd"/>
-      <w:r>
-        <w:t xml:space="preserve"> activations and L2 regularization), and a single Linear output neuron.</w:t>
-      </w:r>
-    </w:p>
-    <w:p>
-      <w:r>
-        <w:t xml:space="preserve">   - Optimization: Adam optimizer with gradient clipping and </w:t>
-      </w:r>
-      <w:proofErr w:type="spellStart"/>
-      <w:r>
-        <w:t>ModelCheckpoint</w:t>
-      </w:r>
-      <w:proofErr w:type="spellEnd"/>
-      <w:r>
-        <w:t xml:space="preserve"> callbacks monitoring validation loss (</w:t>
-      </w:r>
-      <w:proofErr w:type="spellStart"/>
-      <w:r>
-        <w:t>val_loss</w:t>
-      </w:r>
-      <w:proofErr w:type="spellEnd"/>
-      <w:r>
-        <w:t>) to prevent overfitting.</w:t>
-      </w:r>
-    </w:p>
-    <w:p>
-      <w:r>
-        <w:t xml:space="preserve">   - Artifacts: Serializes the optimized weights (</w:t>
-      </w:r>
-      <w:proofErr w:type="spellStart"/>
-      <w:r>
-        <w:t>model_final.keras</w:t>
-      </w:r>
-      <w:proofErr w:type="spellEnd"/>
-      <w:r>
-        <w:t xml:space="preserve">, </w:t>
-      </w:r>
-      <w:proofErr w:type="spellStart"/>
-      <w:r>
-        <w:t>model_best.keras</w:t>
-      </w:r>
-      <w:proofErr w:type="spellEnd"/>
-      <w:r>
-        <w:t>) and normalization parameters (</w:t>
-      </w:r>
-      <w:proofErr w:type="spellStart"/>
-      <w:r>
-        <w:t>scaler.json</w:t>
-      </w:r>
-      <w:proofErr w:type="spellEnd"/>
-      <w:r>
-        <w:t>) into structured directories.</w:t>
+        <w:t>This documentation guarantees complete auditability, ensuring that future researchers can inspect, verify, and extend the forecasting engine across any extended historical horizon.</w:t>
       </w:r>
     </w:p>
     <w:p/>
-    <w:p>
-      <w:r>
-        <w:t>3. Inference &amp; Advanced Evaluation (ho_infer_ann_retest1_gem.py &amp; advanced_eval_metrics_gem.py):</w:t>
-      </w:r>
-    </w:p>
-    <w:p>
-      <w:r>
-        <w:t xml:space="preserve">   - Feeds out-of-sample testing data through the serialized model to reconstruct price-space predictions (</w:t>
-      </w:r>
-      <w:proofErr w:type="spellStart"/>
-      <w:r>
-        <w:t>pred_close</w:t>
-      </w:r>
-      <w:proofErr w:type="spellEnd"/>
-      <w:r>
-        <w:t>).</w:t>
-      </w:r>
-    </w:p>
-    <w:p>
-      <w:r>
-        <w:t xml:space="preserve">   - Computes a comprehensive suite of advanced validation metrics to evaluate real-world trading utility.</w:t>
-      </w:r>
-    </w:p>
-    <w:p/>
-    <w:p>
-      <w:r>
-        <w:t>---</w:t>
-      </w:r>
-    </w:p>
-    <w:p/>
-    <w:p>
-      <w:r>
-        <w:t>## 3. Black-Box Fidelity &amp; Empirical Findings</w:t>
-      </w:r>
-    </w:p>
-    <w:p>
-      <w:r>
-        <w:t>When evaluated against out-of-sample data, the ANN demonstrates profound capabilities that standard error metrics conceal:</w:t>
-      </w:r>
-    </w:p>
-    <w:p/>
-    <w:p>
-      <w:r>
-        <w:t xml:space="preserve">* Macro-Structural Rank Preservation (IC </w:t>
-      </w:r>
-      <w:proofErr w:type="spellStart"/>
-      <w:r>
-        <w:t>approx</w:t>
-      </w:r>
-      <w:proofErr w:type="spellEnd"/>
-      <w:r>
-        <w:t xml:space="preserve"> 0.9780): The Spearman Rank Information Coefficient reveals an extraordinarily high correlation in global price ordering. The ANN successfully internalizes the multi-decade macro-trajectory of the commodity rather than fitting random noise.</w:t>
-      </w:r>
-    </w:p>
-    <w:p>
-      <w:r>
-        <w:t>* Directional Edge &amp; Turning Point Precision: Beyond static error rates, the model achieves positive directional hit rates (&gt;52%) and robust inflection-point precision (&gt;56%), indicating that its multi-layer non-linear transformations capture real market momentum shifts and local reversals.</w:t>
-      </w:r>
-    </w:p>
-    <w:p>
-      <w:r>
-        <w:lastRenderedPageBreak/>
-        <w:t xml:space="preserve">* Atheoretical Viability: Because the neural network maps non-linear feature interactions without being handcuffed by stationary equilibrium assumptions, it serves as a viable, empirical foundation for automated trading and execution </w:t>
-      </w:r>
-      <w:proofErr w:type="spellStart"/>
-      <w:r>
-        <w:t>backtesters</w:t>
-      </w:r>
-      <w:proofErr w:type="spellEnd"/>
-      <w:r>
-        <w:t>.</w:t>
-      </w:r>
-    </w:p>
-    <w:p/>
-    <w:p>
-      <w:r>
-        <w:t>---</w:t>
-      </w:r>
-    </w:p>
-    <w:p/>
-    <w:p>
-      <w:r>
-        <w:t>## 4. Replication Guide (For Future Maintainers)</w:t>
-      </w:r>
-    </w:p>
-    <w:p>
-      <w:r>
-        <w:t>To replicate this simulation environment and regenerate all models, predictions, and evaluation manifests from scratch, execute the following sequence:</w:t>
-      </w:r>
-    </w:p>
-    <w:p/>
-    <w:p>
-      <w:r>
-        <w:t>Prerequisites:</w:t>
-      </w:r>
-    </w:p>
-    <w:p>
-      <w:r>
-        <w:t>- Python 3.10+</w:t>
-      </w:r>
-    </w:p>
-    <w:p>
-      <w:r>
-        <w:t>- TensorFlow 2.x, NumPy, Pandas, Scikit-Learn, SciPy</w:t>
-      </w:r>
-    </w:p>
-    <w:p/>
-    <w:p>
-      <w:r>
-        <w:t>Step-by-Step Execution:</w:t>
-      </w:r>
-    </w:p>
-    <w:p>
-      <w:r>
-        <w:t>1. Clone/Setup Workspace: Ensure all training, validation, and testing CSV files reside in the root directory.</w:t>
-      </w:r>
-    </w:p>
-    <w:p>
-      <w:r>
-        <w:t>2. Execute Training:</w:t>
-      </w:r>
-    </w:p>
-    <w:p>
-      <w:r>
-        <w:t xml:space="preserve">   python ho_train_ann_retest1_gem.py --</w:t>
-      </w:r>
-      <w:proofErr w:type="spellStart"/>
-      <w:r>
-        <w:t>train_csv</w:t>
-      </w:r>
-      <w:proofErr w:type="spellEnd"/>
-      <w:r>
-        <w:t xml:space="preserve"> hoxnc_training_retest1.csv --</w:t>
-      </w:r>
-      <w:proofErr w:type="spellStart"/>
-      <w:r>
-        <w:t>val_csv</w:t>
-      </w:r>
-      <w:proofErr w:type="spellEnd"/>
-      <w:r>
-        <w:t xml:space="preserve"> hoxnc_validation_retest1.csv --</w:t>
-      </w:r>
-      <w:proofErr w:type="spellStart"/>
-      <w:r>
-        <w:t>outdir</w:t>
-      </w:r>
-      <w:proofErr w:type="spellEnd"/>
-      <w:r>
-        <w:t xml:space="preserve"> artifacts/ho_ann_run_retest1</w:t>
-      </w:r>
-    </w:p>
-    <w:p>
-      <w:r>
-        <w:t>3. Run Out-of-Sample Inference:</w:t>
-      </w:r>
-    </w:p>
-    <w:p>
-      <w:r>
-        <w:t xml:space="preserve">   python ho_infer_ann_retest1_gem.py --</w:t>
-      </w:r>
-      <w:proofErr w:type="spellStart"/>
-      <w:r>
-        <w:t>input_csv</w:t>
-      </w:r>
-      <w:proofErr w:type="spellEnd"/>
-      <w:r>
-        <w:t xml:space="preserve"> hoxnc_testing_retest1.csv --model artifacts/ho_ann_run_retest1/</w:t>
-      </w:r>
-      <w:proofErr w:type="spellStart"/>
-      <w:r>
-        <w:t>model_final.keras</w:t>
-      </w:r>
-      <w:proofErr w:type="spellEnd"/>
-      <w:r>
-        <w:t xml:space="preserve"> --scaler artifacts/ho_ann_run_retest1/</w:t>
-      </w:r>
-      <w:proofErr w:type="spellStart"/>
-      <w:r>
-        <w:t>scaler.json</w:t>
-      </w:r>
-      <w:proofErr w:type="spellEnd"/>
-      <w:r>
-        <w:t xml:space="preserve"> --</w:t>
-      </w:r>
-      <w:proofErr w:type="spellStart"/>
-      <w:r>
-        <w:t>out_csv</w:t>
-      </w:r>
-      <w:proofErr w:type="spellEnd"/>
-      <w:r>
-        <w:t xml:space="preserve"> artifacts/ho_ann_run_retest1/inference_rebuild/preds_model_retest1.json</w:t>
-      </w:r>
-    </w:p>
-    <w:p>
-      <w:r>
-        <w:t>4. Evaluate Advanced Metrics:</w:t>
-      </w:r>
-    </w:p>
-    <w:p>
-      <w:r>
-        <w:t xml:space="preserve">   python advanced_eval_metrics_gem.py</w:t>
-      </w:r>
-    </w:p>
-    <w:p/>
-    <w:p>
-      <w:r>
-        <w:t>This documentation guarantees complete auditability, ensuring that future researchers can inspect, verify, and extend the forecasting engine across any extended historical horizon.</w:t>
-      </w:r>
-    </w:p>
     <w:sectPr>
       <w:pgSz w:w="11906" w:h="16838"/>
       <w:pgMar w:top="1440" w:right="1440" w:bottom="1440" w:left="1440" w:header="708" w:footer="708" w:gutter="0"/>
@@ -387,6 +359,163 @@
     </w:sectPr>
   </w:body>
 </w:document>
+</file>
+
+<file path=word/numbering.xml><?xml version="1.0" encoding="utf-8"?>
+<w:numbering xmlns:wpc="http://schemas.microsoft.com/office/word/2010/wordprocessingCanvas" xmlns:cx="http://schemas.microsoft.com/office/drawing/2014/chartex" xmlns:cx1="http://schemas.microsoft.com/office/drawing/2015/9/8/chartex" xmlns:cx2="http://schemas.microsoft.com/office/drawing/2015/10/21/chartex" xmlns:cx3="http://schemas.microsoft.com/office/drawing/2016/5/9/chartex" xmlns:cx4="http://schemas.microsoft.com/office/drawing/2016/5/10/chartex" xmlns:cx5="http://schemas.microsoft.com/office/drawing/2016/5/11/chartex" xmlns:cx6="http://schemas.microsoft.com/office/drawing/2016/5/12/chartex" xmlns:cx7="http://schemas.microsoft.com/office/drawing/2016/5/13/chartex" xmlns:cx8="http://schemas.microsoft.com/office/drawing/2016/5/14/chartex" xmlns:mc="http://schemas.openxmlformats.org/markup-compatibility/2006" xmlns:aink="http://schemas.microsoft.com/office/drawing/2016/ink" xmlns:am3d="http://schemas.microsoft.com/office/drawing/2017/model3d" xmlns:o="urn:schemas-microsoft-com:office:office" xmlns:oel="http://schemas.microsoft.com/office/2019/extlst" xmlns:r="http://schemas.openxmlformats.org/officeDocument/2006/relationships" xmlns:m="http://schemas.openxmlformats.org/officeDocument/2006/math" xmlns:v="urn:schemas-microsoft-com:vml" xmlns:wp14="http://schemas.microsoft.com/office/word/2010/wordprocessingDrawing" xmlns:wp="http://schemas.openxmlformats.org/drawingml/2006/wordprocessingDrawing" xmlns:w10="urn:schemas-microsoft-com:office:word" xmlns:w="http://schemas.openxmlformats.org/wordprocessingml/2006/main" xmlns:w14="http://schemas.microsoft.com/office/word/2010/wordml" xmlns:w15="http://schemas.microsoft.com/office/word/2012/wordml" xmlns:w16cex="http://schemas.microsoft.com/office/word/2018/wordml/cex" xmlns:w16cid="http://schemas.microsoft.com/office/word/2016/wordml/cid" xmlns:w16="http://schemas.microsoft.com/office/word/2018/wordml" xmlns:w16du="http://schemas.microsoft.com/office/word/2023/wordml/word16du" xmlns:w16sdtdh="http://schemas.microsoft.com/office/word/2020/wordml/sdtdatahash" xmlns:w16sdtfl="http://schemas.microsoft.com/office/word/2024/wordml/sdtformatlock" xmlns:w16se="http://schemas.microsoft.com/office/word/2015/wordml/symex" xmlns:wpg="http://schemas.microsoft.com/office/word/2010/wordprocessingGroup" xmlns:wpi="http://schemas.microsoft.com/office/word/2010/wordprocessingInk" xmlns:wne="http://schemas.microsoft.com/office/word/2006/wordml" xmlns:wps="http://schemas.microsoft.com/office/word/2010/wordprocessingShape" mc:Ignorable="w14 w15 w16se w16cid w16 w16cex w16sdtdh w16sdtfl w16du wp14">
+  <w:abstractNum w:abstractNumId="0" w15:restartNumberingAfterBreak="0">
+    <w:nsid w:val="0C1378DF"/>
+    <w:multiLevelType w:val="multilevel"/>
+    <w:tmpl w:val="BD6C79FC"/>
+    <w:lvl w:ilvl="0">
+      <w:start w:val="1"/>
+      <w:numFmt w:val="bullet"/>
+      <w:lvlText w:val=""/>
+      <w:lvlJc w:val="left"/>
+      <w:pPr>
+        <w:tabs>
+          <w:tab w:val="num" w:pos="720"/>
+        </w:tabs>
+        <w:ind w:left="720" w:hanging="360"/>
+      </w:pPr>
+      <w:rPr>
+        <w:rFonts w:ascii="Symbol" w:hAnsi="Symbol" w:hint="default"/>
+        <w:sz w:val="20"/>
+      </w:rPr>
+    </w:lvl>
+    <w:lvl w:ilvl="1" w:tentative="1">
+      <w:start w:val="1"/>
+      <w:numFmt w:val="bullet"/>
+      <w:lvlText w:val="o"/>
+      <w:lvlJc w:val="left"/>
+      <w:pPr>
+        <w:tabs>
+          <w:tab w:val="num" w:pos="1440"/>
+        </w:tabs>
+        <w:ind w:left="1440" w:hanging="360"/>
+      </w:pPr>
+      <w:rPr>
+        <w:rFonts w:ascii="Courier New" w:hAnsi="Courier New" w:hint="default"/>
+        <w:sz w:val="20"/>
+      </w:rPr>
+    </w:lvl>
+    <w:lvl w:ilvl="2" w:tentative="1">
+      <w:start w:val="1"/>
+      <w:numFmt w:val="bullet"/>
+      <w:lvlText w:val=""/>
+      <w:lvlJc w:val="left"/>
+      <w:pPr>
+        <w:tabs>
+          <w:tab w:val="num" w:pos="2160"/>
+        </w:tabs>
+        <w:ind w:left="2160" w:hanging="360"/>
+      </w:pPr>
+      <w:rPr>
+        <w:rFonts w:ascii="Wingdings" w:hAnsi="Wingdings" w:hint="default"/>
+        <w:sz w:val="20"/>
+      </w:rPr>
+    </w:lvl>
+    <w:lvl w:ilvl="3" w:tentative="1">
+      <w:start w:val="1"/>
+      <w:numFmt w:val="bullet"/>
+      <w:lvlText w:val=""/>
+      <w:lvlJc w:val="left"/>
+      <w:pPr>
+        <w:tabs>
+          <w:tab w:val="num" w:pos="2880"/>
+        </w:tabs>
+        <w:ind w:left="2880" w:hanging="360"/>
+      </w:pPr>
+      <w:rPr>
+        <w:rFonts w:ascii="Wingdings" w:hAnsi="Wingdings" w:hint="default"/>
+        <w:sz w:val="20"/>
+      </w:rPr>
+    </w:lvl>
+    <w:lvl w:ilvl="4" w:tentative="1">
+      <w:start w:val="1"/>
+      <w:numFmt w:val="bullet"/>
+      <w:lvlText w:val=""/>
+      <w:lvlJc w:val="left"/>
+      <w:pPr>
+        <w:tabs>
+          <w:tab w:val="num" w:pos="3600"/>
+        </w:tabs>
+        <w:ind w:left="3600" w:hanging="360"/>
+      </w:pPr>
+      <w:rPr>
+        <w:rFonts w:ascii="Wingdings" w:hAnsi="Wingdings" w:hint="default"/>
+        <w:sz w:val="20"/>
+      </w:rPr>
+    </w:lvl>
+    <w:lvl w:ilvl="5" w:tentative="1">
+      <w:start w:val="1"/>
+      <w:numFmt w:val="bullet"/>
+      <w:lvlText w:val=""/>
+      <w:lvlJc w:val="left"/>
+      <w:pPr>
+        <w:tabs>
+          <w:tab w:val="num" w:pos="4320"/>
+        </w:tabs>
+        <w:ind w:left="4320" w:hanging="360"/>
+      </w:pPr>
+      <w:rPr>
+        <w:rFonts w:ascii="Wingdings" w:hAnsi="Wingdings" w:hint="default"/>
+        <w:sz w:val="20"/>
+      </w:rPr>
+    </w:lvl>
+    <w:lvl w:ilvl="6" w:tentative="1">
+      <w:start w:val="1"/>
+      <w:numFmt w:val="bullet"/>
+      <w:lvlText w:val=""/>
+      <w:lvlJc w:val="left"/>
+      <w:pPr>
+        <w:tabs>
+          <w:tab w:val="num" w:pos="5040"/>
+        </w:tabs>
+        <w:ind w:left="5040" w:hanging="360"/>
+      </w:pPr>
+      <w:rPr>
+        <w:rFonts w:ascii="Wingdings" w:hAnsi="Wingdings" w:hint="default"/>
+        <w:sz w:val="20"/>
+      </w:rPr>
+    </w:lvl>
+    <w:lvl w:ilvl="7" w:tentative="1">
+      <w:start w:val="1"/>
+      <w:numFmt w:val="bullet"/>
+      <w:lvlText w:val=""/>
+      <w:lvlJc w:val="left"/>
+      <w:pPr>
+        <w:tabs>
+          <w:tab w:val="num" w:pos="5760"/>
+        </w:tabs>
+        <w:ind w:left="5760" w:hanging="360"/>
+      </w:pPr>
+      <w:rPr>
+        <w:rFonts w:ascii="Wingdings" w:hAnsi="Wingdings" w:hint="default"/>
+        <w:sz w:val="20"/>
+      </w:rPr>
+    </w:lvl>
+    <w:lvl w:ilvl="8" w:tentative="1">
+      <w:start w:val="1"/>
+      <w:numFmt w:val="bullet"/>
+      <w:lvlText w:val=""/>
+      <w:lvlJc w:val="left"/>
+      <w:pPr>
+        <w:tabs>
+          <w:tab w:val="num" w:pos="6480"/>
+        </w:tabs>
+        <w:ind w:left="6480" w:hanging="360"/>
+      </w:pPr>
+      <w:rPr>
+        <w:rFonts w:ascii="Wingdings" w:hAnsi="Wingdings" w:hint="default"/>
+        <w:sz w:val="20"/>
+      </w:rPr>
+    </w:lvl>
+  </w:abstractNum>
+  <w:num w:numId="1" w16cid:durableId="558639879">
+    <w:abstractNumId w:val="0"/>
+  </w:num>
+</w:numbering>
 </file>
 
 <file path=word/styles.xml><?xml version="1.0" encoding="utf-8"?>
@@ -1306,6 +1435,36 @@
       <w:spacing w:val="5"/>
     </w:rPr>
   </w:style>
+  <w:style w:type="paragraph" w:styleId="NormalWeb">
+    <w:name w:val="Normal (Web)"/>
+    <w:basedOn w:val="Normal"/>
+    <w:uiPriority w:val="99"/>
+    <w:semiHidden/>
+    <w:unhideWhenUsed/>
+    <w:rsid w:val="004E4BC0"/>
+    <w:pPr>
+      <w:spacing w:before="100" w:beforeAutospacing="1" w:after="100" w:afterAutospacing="1" w:line="240" w:lineRule="auto"/>
+    </w:pPr>
+    <w:rPr>
+      <w:rFonts w:ascii="Times New Roman" w:eastAsia="Times New Roman" w:hAnsi="Times New Roman" w:cs="Times New Roman"/>
+      <w:kern w:val="0"/>
+      <w:lang w:eastAsia="en-AU"/>
+      <w14:ligatures w14:val="none"/>
+    </w:rPr>
+  </w:style>
+  <w:style w:type="character" w:styleId="HTMLCode">
+    <w:name w:val="HTML Code"/>
+    <w:basedOn w:val="DefaultParagraphFont"/>
+    <w:uiPriority w:val="99"/>
+    <w:semiHidden/>
+    <w:unhideWhenUsed/>
+    <w:rsid w:val="004E4BC0"/>
+    <w:rPr>
+      <w:rFonts w:ascii="Courier New" w:eastAsia="Times New Roman" w:hAnsi="Courier New" w:cs="Courier New"/>
+      <w:sz w:val="20"/>
+      <w:szCs w:val="20"/>
+    </w:rPr>
+  </w:style>
 </w:styles>
 </file>
 

</xml_diff>